<commit_message>
docs(manuals): tell operators how to register a forgotten service in the Spanish user manual (4.6)
</commit_message>
<xml_diff>
--- a/09_MANUALES/ES/WORD/09_Manual_De_Usuario.docx
+++ b/09_MANUALES/ES/WORD/09_Manual_De_Usuario.docx
@@ -2,7 +2,7 @@
 <file path=word/document.xml><?xml version="1.0" encoding="utf-8"?>
 <w:document xmlns:w="http://schemas.openxmlformats.org/wordprocessingml/2006/main" xmlns:m="http://schemas.openxmlformats.org/officeDocument/2006/math" xmlns:r="http://schemas.openxmlformats.org/officeDocument/2006/relationships" xmlns:o="urn:schemas-microsoft-com:office:office" xmlns:v="urn:schemas-microsoft-com:vml" xmlns:w10="urn:schemas-microsoft-com:office:word" xmlns:a="http://schemas.openxmlformats.org/drawingml/2006/main" xmlns:pic="http://schemas.openxmlformats.org/drawingml/2006/picture" xmlns:wp="http://schemas.openxmlformats.org/drawingml/2006/wordprocessingDrawing">
   <w:body>
-    <w:bookmarkStart w:id="184" w:name="manual-de-usuario"/>
+    <w:bookmarkStart w:id="186" w:name="manual-de-usuario"/>
     <w:p>
       <w:pPr>
         <w:pStyle w:val="Heading1"/>
@@ -64,15 +64,15 @@
         <w:pStyle w:val="BodyText"/>
       </w:pPr>
       <w:r>
-        <w:t xml:space="preserve">17 de octubre de 2026</w:t>
-      </w:r>
-    </w:p>
-    <w:p>
-      <w:pPr>
-        <w:pStyle w:val="BodyText"/>
-      </w:pPr>
-      <w:r>
-        <w:t xml:space="preserve">Tipo de manual: Manual de usuario (roles Cliente y Operario) · Versión 4.1</w:t>
+        <w:t xml:space="preserve">21 de octubre de 2026</w:t>
+      </w:r>
+    </w:p>
+    <w:p>
+      <w:pPr>
+        <w:pStyle w:val="BodyText"/>
+      </w:pPr>
+      <w:r>
+        <w:t xml:space="preserve">Tipo de manual: Manual de usuario (roles Cliente y Operario) · Versión 4.6</w:t>
       </w:r>
     </w:p>
     <w:bookmarkStart w:id="20" w:name="control-de-versiones"/>
@@ -620,6 +620,114 @@
           </w:p>
         </w:tc>
       </w:tr>
+      <w:tr>
+        <w:tc>
+          <w:tcPr/>
+          <w:p>
+            <w:pPr>
+              <w:pStyle w:val="Compact"/>
+            </w:pPr>
+            <w:r>
+              <w:t xml:space="preserve">4.5</w:t>
+            </w:r>
+          </w:p>
+        </w:tc>
+        <w:tc>
+          <w:tcPr/>
+          <w:p>
+            <w:pPr>
+              <w:pStyle w:val="Compact"/>
+            </w:pPr>
+            <w:r>
+              <w:t xml:space="preserve">2026-10-21</w:t>
+            </w:r>
+          </w:p>
+        </w:tc>
+        <w:tc>
+          <w:tcPr/>
+          <w:p>
+            <w:pPr>
+              <w:pStyle w:val="Compact"/>
+            </w:pPr>
+            <w:r>
+              <w:t xml:space="preserve">Revisión contra el código del 21 de octubre de 2026: el comprobante se reduce a menos de 2 MB antes de enviarlo y el QR se amplía con</w:t>
+            </w:r>
+            <w:r>
+              <w:t xml:space="preserve"> </w:t>
+            </w:r>
+            <w:r>
+              <w:rPr>
+                <w:b/>
+                <w:bCs/>
+              </w:rPr>
+              <w:t xml:space="preserve">Ampliar QR</w:t>
+            </w:r>
+            <w:r>
+              <w:t xml:space="preserve"> </w:t>
+            </w:r>
+            <w:r>
+              <w:t xml:space="preserve">(sección 10.1.5); Efectivo solo aparece si el lavadero tiene activa esa cuenta; las reservas que nadie inicia se cierran solas una hora después de su hora de fin (Tabla 7, sección 10.2.3 y preguntas frecuentes); al cerrar sesión, las demás pestañas también salen (sección 12); la aplicación móvil pide instalar el APK nuevo cuando se publica (sección 6.2). Se corrigieron la fecha y la versión de la portada.</w:t>
+            </w:r>
+          </w:p>
+        </w:tc>
+        <w:tc>
+          <w:tcPr/>
+          <w:p>
+            <w:pPr>
+              <w:pStyle w:val="Compact"/>
+            </w:pPr>
+            <w:r>
+              <w:t xml:space="preserve">Equipo de desarrollo</w:t>
+            </w:r>
+          </w:p>
+        </w:tc>
+      </w:tr>
+      <w:tr>
+        <w:tc>
+          <w:tcPr/>
+          <w:p>
+            <w:pPr>
+              <w:pStyle w:val="Compact"/>
+            </w:pPr>
+            <w:r>
+              <w:t xml:space="preserve">4.6</w:t>
+            </w:r>
+          </w:p>
+        </w:tc>
+        <w:tc>
+          <w:tcPr/>
+          <w:p>
+            <w:pPr>
+              <w:pStyle w:val="Compact"/>
+            </w:pPr>
+            <w:r>
+              <w:t xml:space="preserve">2026-10-21</w:t>
+            </w:r>
+          </w:p>
+        </w:tc>
+        <w:tc>
+          <w:tcPr/>
+          <w:p>
+            <w:pPr>
+              <w:pStyle w:val="Compact"/>
+            </w:pPr>
+            <w:r>
+              <w:t xml:space="preserve">Cambio de la regla de las reservas que terminan sin registrarse, revisada por el equipo la noche del 21 de octubre: solo la reserva confirmada que nunca tuvo operario pasa sola a No asistió; si tenía operario, el operario recibe el aviso "¿Atendiste este servicio?" y el administrador la cierra (Tabla 7, secciones 10.2.3 y 10.2.4 y preguntas frecuentes). La agenda y los servicios asignados ya no muestran reservas canceladas ni en No asistió.</w:t>
+            </w:r>
+          </w:p>
+        </w:tc>
+        <w:tc>
+          <w:tcPr/>
+          <w:p>
+            <w:pPr>
+              <w:pStyle w:val="Compact"/>
+            </w:pPr>
+            <w:r>
+              <w:t xml:space="preserve">Equipo de desarrollo</w:t>
+            </w:r>
+          </w:p>
+        </w:tc>
+      </w:tr>
     </w:tbl>
     <w:p>
       <w:pPr>
@@ -1606,7 +1714,7 @@
         </w:numPr>
       </w:pPr>
       <w:r>
-        <w:t xml:space="preserve">La aplicación móvil Android (React Native con Expo), que ofrece módulos equivalentes para los tres roles. Se descarga desde la página de inicio de la web con el botón de descarga o el código QR; este manual documenta solo la versión web.</w:t>
+        <w:t xml:space="preserve">La aplicación móvil Android (React Native con Expo), que ofrece módulos equivalentes para los tres roles. Se descarga desde la página de inicio de la web con el botón de descarga o el código QR; este manual documenta solo la versión web. Desde el 21 de octubre de 2026, cuando el lavadero publica una versión nueva del APK, la aplicación muestra una pantalla que pide descargarla e instalarla antes de seguir.</w:t>
       </w:r>
     </w:p>
     <w:p>
@@ -7629,7 +7737,7 @@
               <w:pStyle w:val="Compact"/>
             </w:pPr>
             <w:r>
-              <w:t xml:space="preserve">La reserva fue anulada por el cliente o por el lavadero.</w:t>
+              <w:t xml:space="preserve">La reserva fue anulada por el cliente o por el lavadero, o el sistema la cerró porque pasó una hora de su fin sin confirmarse.</w:t>
             </w:r>
           </w:p>
         </w:tc>
@@ -7664,7 +7772,7 @@
               <w:pStyle w:val="Compact"/>
             </w:pPr>
             <w:r>
-              <w:t xml:space="preserve">El cliente no llegó al turno reservado.</w:t>
+              <w:t xml:space="preserve">El cliente no llegó al turno reservado y el lavadero lo registró así. Si la reserva confirmada nunca tuvo operario, el sistema la marca así una hora después de su hora de fin.</w:t>
             </w:r>
           </w:p>
         </w:tc>
@@ -8001,7 +8109,7 @@
               <w:pStyle w:val="Compact"/>
             </w:pPr>
             <w:r>
-              <w:t xml:space="preserve">Se paga en el lavadero al recibir el servicio. No se muestra código QR.</w:t>
+              <w:t xml:space="preserve">Se paga en el lavadero al recibir el servicio. No se muestra código QR. Solo aparece si el lavadero tiene activa la cuenta de efectivo.</w:t>
             </w:r>
           </w:p>
         </w:tc>
@@ -8033,7 +8141,7 @@
         <w:t xml:space="preserve"> </w:t>
       </w:r>
       <w:r>
-        <w:t xml:space="preserve">Los métodos digitales que se muestran dependen de las cuentas de pago que el administrador mantenga activas.</w:t>
+        <w:t xml:space="preserve">Los métodos que se muestran, incluido Efectivo, dependen de las cuentas de pago que el administrador mantenga activas.</w:t>
       </w:r>
     </w:p>
     <w:p>
@@ -8384,7 +8492,55 @@
         <w:t xml:space="preserve">Monto a pagar</w:t>
       </w:r>
       <w:r>
-        <w:t xml:space="preserve">.</w:t>
+        <w:t xml:space="preserve">. Si el código es difícil de leer,</w:t>
+      </w:r>
+      <w:r>
+        <w:t xml:space="preserve"> </w:t>
+      </w:r>
+      <w:r>
+        <w:rPr>
+          <w:b/>
+          <w:bCs/>
+        </w:rPr>
+        <w:t xml:space="preserve">Ampliar QR</w:t>
+      </w:r>
+      <w:r>
+        <w:t xml:space="preserve"> </w:t>
+      </w:r>
+      <w:r>
+        <w:t xml:space="preserve">lo muestra más grande, con</w:t>
+      </w:r>
+      <w:r>
+        <w:t xml:space="preserve"> </w:t>
+      </w:r>
+      <w:r>
+        <w:rPr>
+          <w:b/>
+          <w:bCs/>
+        </w:rPr>
+        <w:t xml:space="preserve">Acercar</w:t>
+      </w:r>
+      <w:r>
+        <w:t xml:space="preserve"> </w:t>
+      </w:r>
+      <w:r>
+        <w:t xml:space="preserve">y</w:t>
+      </w:r>
+      <w:r>
+        <w:t xml:space="preserve"> </w:t>
+      </w:r>
+      <w:r>
+        <w:rPr>
+          <w:b/>
+          <w:bCs/>
+        </w:rPr>
+        <w:t xml:space="preserve">Alejar</w:t>
+      </w:r>
+      <w:r>
+        <w:t xml:space="preserve"> </w:t>
+      </w:r>
+      <w:r>
+        <w:t xml:space="preserve">(también con la rueda del mouse o con doble clic).</w:t>
       </w:r>
     </w:p>
     <w:p>
@@ -8409,7 +8565,7 @@
         <w:t xml:space="preserve">Confirma tu pago</w:t>
       </w:r>
       <w:r>
-        <w:t xml:space="preserve">, arrastrar la imagen del comprobante o hacer clic para buscarla (JPG o PNG, máximo 10 MB).</w:t>
+        <w:t xml:space="preserve">, arrastrar la imagen del comprobante o hacer clic para buscarla (JPG o PNG de hasta 10 MB). La página la reduce a menos de 2 MB antes de enviarla; mientras tanto muestra "Preparando el comprobante...".</w:t>
       </w:r>
     </w:p>
     <w:p>
@@ -8598,6 +8754,18 @@
       </w:pPr>
       <w:r>
         <w:t xml:space="preserve">Si el administrador rechaza el pago, el cliente puede reportarlo de nuevo con un comprobante correcto.</w:t>
+      </w:r>
+    </w:p>
+    <w:p>
+      <w:pPr>
+        <w:pStyle w:val="Compact"/>
+        <w:numPr>
+          <w:ilvl w:val="0"/>
+          <w:numId w:val="1022"/>
+        </w:numPr>
+      </w:pPr>
+      <w:r>
+        <w:t xml:space="preserve">Si la imagen no se puede reducir a menos de 2 MB, aparece "No pudimos reducir la imagen a menos de 2 MB. Prueba con una captura de pantalla del comprobante."</w:t>
       </w:r>
     </w:p>
     <w:p>
@@ -12609,7 +12777,36 @@
         <w:t xml:space="preserve"> </w:t>
       </w:r>
       <w:r>
-        <w:t xml:space="preserve">El servicio se puede iniciar desde 15 minutos antes de la hora reservada. El operario solo puede actualizar los servicios que tiene asignados.</w:t>
+        <w:t xml:space="preserve">El servicio se puede iniciar desde 15 minutos antes de la hora reservada. El operario solo puede actualizar los servicios que tiene asignados. Cada servicio se debe registrar con</w:t>
+      </w:r>
+      <w:r>
+        <w:t xml:space="preserve"> </w:t>
+      </w:r>
+      <w:r>
+        <w:rPr>
+          <w:b/>
+          <w:bCs/>
+        </w:rPr>
+        <w:t xml:space="preserve">Iniciar</w:t>
+      </w:r>
+      <w:r>
+        <w:t xml:space="preserve"> </w:t>
+      </w:r>
+      <w:r>
+        <w:t xml:space="preserve">y</w:t>
+      </w:r>
+      <w:r>
+        <w:t xml:space="preserve"> </w:t>
+      </w:r>
+      <w:r>
+        <w:rPr>
+          <w:b/>
+          <w:bCs/>
+        </w:rPr>
+        <w:t xml:space="preserve">Finalizar</w:t>
+      </w:r>
+      <w:r>
+        <w:t xml:space="preserve">, aunque se haga tarde: si la hora del servicio ya pasó, todavía se puede iniciar y finalizar ese mismo día, y cuentan las horas reales. Si un servicio asignado no se inició cuando terminó su hora, o se inició y no se finalizó una hora después de su hora de fin, el operario recibe el aviso "¿Atendiste este servicio?" y el administrador ve la reserva en su lista de reservas por cerrar; si ya no es posible registrarlo, el operario le informa al administrador si atendió o no el vehículo, y el administrador lo cierra. La agenda y la lista de servicios asignados no muestran las reservas canceladas ni las que quedaron en No asistió.</w:t>
       </w:r>
     </w:p>
     <w:p>
@@ -12966,7 +13163,7 @@
         <w:pStyle w:val="FirstParagraph"/>
       </w:pPr>
       <w:r>
-        <w:t xml:space="preserve">Las notificaciones del operario funcionan como las del cliente (sección 10.1.7). Los avisos más frecuentes son un nuevo servicio asignado, un servicio movido a otra hora, un servicio cancelado y un servicio reasignado a otro operario. Estos avisos al personal llegan a la bandeja y como notificación push, nunca por correo. El operario los abre con</w:t>
+        <w:t xml:space="preserve">Las notificaciones del operario funcionan como las del cliente (sección 10.1.7). Los avisos más frecuentes son un nuevo servicio asignado, un servicio movido a otra hora, un servicio cancelado y un servicio reasignado a otro operario. Desde el 21 de octubre de 2026 también llega el aviso "¿Atendiste este servicio?" cuando un servicio terminó su hora y no se inició o no se finalizó (una sola vez por reserva; sección 10.2.3). Estos avisos al personal llegan a la bandeja y como notificación push, nunca por correo. El operario los abre con</w:t>
       </w:r>
       <w:r>
         <w:t xml:space="preserve"> </w:t>
@@ -14772,7 +14969,7 @@
               <w:pStyle w:val="Compact"/>
             </w:pPr>
             <w:r>
-              <w:t xml:space="preserve">Terminó la sesión de una hora.</w:t>
+              <w:t xml:space="preserve">Terminó la sesión de una hora, o la sesión se cerró (por ejemplo, porque el administrador desactivó la cuenta).</w:t>
             </w:r>
           </w:p>
         </w:tc>
@@ -15239,6 +15436,41 @@
             </w:pPr>
             <w:r>
               <w:t xml:space="preserve">Adjuntar una imagen válida.</w:t>
+            </w:r>
+          </w:p>
+        </w:tc>
+      </w:tr>
+      <w:tr>
+        <w:tc>
+          <w:tcPr/>
+          <w:p>
+            <w:pPr>
+              <w:pStyle w:val="Compact"/>
+            </w:pPr>
+            <w:r>
+              <w:t xml:space="preserve">No pudimos reducir la imagen a menos de 2 MB. Prueba con una captura de pantalla del comprobante.</w:t>
+            </w:r>
+          </w:p>
+        </w:tc>
+        <w:tc>
+          <w:tcPr/>
+          <w:p>
+            <w:pPr>
+              <w:pStyle w:val="Compact"/>
+            </w:pPr>
+            <w:r>
+              <w:t xml:space="preserve">La foto del comprobante es demasiado pesada aun después de reducirla.</w:t>
+            </w:r>
+          </w:p>
+        </w:tc>
+        <w:tc>
+          <w:tcPr/>
+          <w:p>
+            <w:pPr>
+              <w:pStyle w:val="Compact"/>
+            </w:pPr>
+            <w:r>
+              <w:t xml:space="preserve">Adjuntar una captura de pantalla del comprobante.</w:t>
             </w:r>
           </w:p>
         </w:tc>
@@ -15618,6 +15850,14 @@
     <w:p>
       <w:pPr>
         <w:pStyle w:val="FirstParagraph"/>
+      </w:pPr>
+      <w:r>
+        <w:t xml:space="preserve">Al cerrar sesión, las demás pestañas del mismo navegador también vuelven a la pantalla de inicio de sesión, y si en una pestaña se entra con otra cuenta, las otras se recargan con esa cuenta. Desde el 21 de octubre de 2026 la sesión cerrada tampoco sirve en el servidor, aunque alguien hubiera copiado su acceso.</w:t>
+      </w:r>
+    </w:p>
+    <w:p>
+      <w:pPr>
+        <w:pStyle w:val="BodyText"/>
       </w:pPr>
       <w:r>
         <w:rPr>
@@ -15687,7 +15927,7 @@
       </w:r>
     </w:p>
     <w:bookmarkEnd w:id="158"/>
-    <w:bookmarkStart w:id="175" w:name="Xf910ca678986d15045638a6d2c742a7d5deabf2"/>
+    <w:bookmarkStart w:id="177" w:name="Xf910ca678986d15045638a6d2c742a7d5deabf2"/>
     <w:p>
       <w:pPr>
         <w:pStyle w:val="Heading2"/>
@@ -15854,12 +16094,30 @@
       </w:r>
     </w:p>
     <w:bookmarkEnd w:id="165"/>
-    <w:bookmarkStart w:id="166" w:name="cómo-pago-mi-servicio"/>
+    <w:bookmarkStart w:id="166" w:name="qué-pasa-si-no-llego-a-mi-reserva"/>
     <w:p>
       <w:pPr>
         <w:pStyle w:val="Heading5"/>
       </w:pPr>
       <w:r>
+        <w:t xml:space="preserve">¿Qué pasa si no llego a mi reserva?</w:t>
+      </w:r>
+    </w:p>
+    <w:p>
+      <w:pPr>
+        <w:pStyle w:val="FirstParagraph"/>
+      </w:pPr>
+      <w:r>
+        <w:t xml:space="preserve">El lavadero registra la reserva como No asistió. Si la reserva no tenía operario asignado, el sistema la marca así una hora después de la hora de fin. Si ya había pagado, contacte al lavadero: el reembolso lo decide el administrador.</w:t>
+      </w:r>
+    </w:p>
+    <w:bookmarkEnd w:id="166"/>
+    <w:bookmarkStart w:id="167" w:name="cómo-pago-mi-servicio"/>
+    <w:p>
+      <w:pPr>
+        <w:pStyle w:val="Heading5"/>
+      </w:pPr>
+      <w:r>
         <w:t xml:space="preserve">¿Cómo pago mi servicio?</w:t>
       </w:r>
     </w:p>
@@ -15868,11 +16126,11 @@
         <w:pStyle w:val="FirstParagraph"/>
       </w:pPr>
       <w:r>
-        <w:t xml:space="preserve">En Pagar servicio, elija el método. Con Nequi, Daviplata o Transferencia, escanee el código QR, transfiera el monto exacto y adjunte el comprobante con la referencia de la transacción; con Efectivo, pague en el lavadero.</w:t>
-      </w:r>
-    </w:p>
-    <w:bookmarkEnd w:id="166"/>
-    <w:bookmarkStart w:id="167" w:name="Xa400369ccdedad642878da0d2855923d027f5d9"/>
+        <w:t xml:space="preserve">En Pagar servicio, elija el método. Con Nequi, Daviplata o Transferencia, escanee el código QR, transfiera el monto exacto y adjunte el comprobante con la referencia de la transacción; con Efectivo (si el lavadero lo tiene activo), pague en el lavadero.</w:t>
+      </w:r>
+    </w:p>
+    <w:bookmarkEnd w:id="167"/>
+    <w:bookmarkStart w:id="168" w:name="Xa400369ccdedad642878da0d2855923d027f5d9"/>
     <w:p>
       <w:pPr>
         <w:pStyle w:val="Heading5"/>
@@ -15889,8 +16147,8 @@
         <w:t xml:space="preserve">No. El sistema no solicita ni guarda datos de tarjetas.</w:t>
       </w:r>
     </w:p>
-    <w:bookmarkEnd w:id="167"/>
-    <w:bookmarkStart w:id="168" w:name="por-qué-mi-pago-aparece-en-revisión"/>
+    <w:bookmarkEnd w:id="168"/>
+    <w:bookmarkStart w:id="169" w:name="por-qué-mi-pago-aparece-en-revisión"/>
     <w:p>
       <w:pPr>
         <w:pStyle w:val="Heading5"/>
@@ -15907,8 +16165,8 @@
         <w:t xml:space="preserve">Porque un administrador debe verificar que el dinero llegó a la cuenta del lavadero. Cuando lo apruebe o lo rechace, usted recibirá una notificación y un correo; también puede consultar el estado en el Historial.</w:t>
       </w:r>
     </w:p>
-    <w:bookmarkEnd w:id="168"/>
-    <w:bookmarkStart w:id="169" w:name="puedo-usar-un-código-de-promoción"/>
+    <w:bookmarkEnd w:id="169"/>
+    <w:bookmarkStart w:id="170" w:name="puedo-usar-un-código-de-promoción"/>
     <w:p>
       <w:pPr>
         <w:pStyle w:val="Heading5"/>
@@ -15925,8 +16183,8 @@
         <w:t xml:space="preserve">Sí. Cuando sus puntos desbloquean un cupón, usted recibe un aviso con su código. En Pagar servicio, escríbalo en Código del cupón y haga clic en Aplicar antes de confirmar el pago.</w:t>
       </w:r>
     </w:p>
-    <w:bookmarkEnd w:id="169"/>
-    <w:bookmarkStart w:id="170" w:name="cómo-gano-puntos-de-fidelización"/>
+    <w:bookmarkEnd w:id="170"/>
+    <w:bookmarkStart w:id="171" w:name="cómo-gano-puntos-de-fidelización"/>
     <w:p>
       <w:pPr>
         <w:pStyle w:val="Heading5"/>
@@ -15943,8 +16201,8 @@
         <w:t xml:space="preserve">Cada servicio suma los puntos que aparecen al reservar ("Suma N puntos"). Los puntos se acreditan cuando el administrador aprueba el pago de la reserva, y su progreso se ve en el panel. Los puntos no se gastan: desbloquean cupones.</w:t>
       </w:r>
     </w:p>
-    <w:bookmarkEnd w:id="170"/>
-    <w:bookmarkStart w:id="171" w:name="cómo-califico-un-servicio"/>
+    <w:bookmarkEnd w:id="171"/>
+    <w:bookmarkStart w:id="172" w:name="cómo-califico-un-servicio"/>
     <w:p>
       <w:pPr>
         <w:pStyle w:val="Heading5"/>
@@ -15961,8 +16219,8 @@
         <w:t xml:space="preserve">Cuando la reserva esté Completada, abra el Historial, haga clic en "Calificar Servicio", elija de una a cinco estrellas y, si lo desea, escriba un comentario. Cada reserva se puede calificar una sola vez.</w:t>
       </w:r>
     </w:p>
-    <w:bookmarkEnd w:id="171"/>
-    <w:bookmarkStart w:id="172" w:name="puedo-cambiar-el-idioma-o-los-colores"/>
+    <w:bookmarkEnd w:id="172"/>
+    <w:bookmarkStart w:id="173" w:name="puedo-cambiar-el-idioma-o-los-colores"/>
     <w:p>
       <w:pPr>
         <w:pStyle w:val="Heading5"/>
@@ -15979,8 +16237,8 @@
         <w:t xml:space="preserve">Sí. En Configuración puede elegir español, inglés, francés o portugués y uno de cuatro temas de color; la elección se guarda en su cuenta.</w:t>
       </w:r>
     </w:p>
-    <w:bookmarkEnd w:id="172"/>
-    <w:bookmarkStart w:id="173" w:name="puedo-eliminar-o-desactivar-mi-cuenta"/>
+    <w:bookmarkEnd w:id="173"/>
+    <w:bookmarkStart w:id="174" w:name="puedo-eliminar-o-desactivar-mi-cuenta"/>
     <w:p>
       <w:pPr>
         <w:pStyle w:val="Heading5"/>
@@ -16013,8 +16271,8 @@
         <w:t xml:space="preserve">desactiva la cuenta, no la borra: no podrá ingresar, pero su historial se conserva. Para reactivarla, contacte al administrador. Las cuentas de administrador no tienen esta opción.</w:t>
       </w:r>
     </w:p>
-    <w:bookmarkEnd w:id="173"/>
-    <w:bookmarkStart w:id="174" w:name="X30c37db94ebb54899b47fa333c3a9ab3ff5cda3"/>
+    <w:bookmarkEnd w:id="174"/>
+    <w:bookmarkStart w:id="175" w:name="X30c37db94ebb54899b47fa333c3a9ab3ff5cda3"/>
     <w:p>
       <w:pPr>
         <w:pStyle w:val="Heading5"/>
@@ -16031,9 +16289,56 @@
         <w:t xml:space="preserve">Un servicio solo se puede iniciar el día de la reserva, solo si está asignado a usted y solo cuando no tiene otro servicio en curso. Si el servicio es suyo y el problema continúa, informe al administrador.</w:t>
       </w:r>
     </w:p>
-    <w:bookmarkEnd w:id="174"/>
     <w:bookmarkEnd w:id="175"/>
-    <w:bookmarkStart w:id="176" w:name="X0da19bed606ac5b85df44bb666d43cc5fe8dad2"/>
+    <w:bookmarkStart w:id="176" w:name="Xb697bc15d0de4dfb802fe3a219c2c39a5a87b37"/>
+    <w:p>
+      <w:pPr>
+        <w:pStyle w:val="Heading5"/>
+      </w:pPr>
+      <w:r>
+        <w:t xml:space="preserve">Atendí un vehículo y olvidé marcar Iniciar. ¿Qué hago?</w:t>
+      </w:r>
+    </w:p>
+    <w:p>
+      <w:pPr>
+        <w:pStyle w:val="FirstParagraph"/>
+      </w:pPr>
+      <w:r>
+        <w:t xml:space="preserve">Si todavía es el mismo día, abra el servicio y márquelo con</w:t>
+      </w:r>
+      <w:r>
+        <w:t xml:space="preserve"> </w:t>
+      </w:r>
+      <w:r>
+        <w:rPr>
+          <w:b/>
+          <w:bCs/>
+        </w:rPr>
+        <w:t xml:space="preserve">Iniciar</w:t>
+      </w:r>
+      <w:r>
+        <w:t xml:space="preserve"> </w:t>
+      </w:r>
+      <w:r>
+        <w:t xml:space="preserve">y luego con</w:t>
+      </w:r>
+      <w:r>
+        <w:t xml:space="preserve"> </w:t>
+      </w:r>
+      <w:r>
+        <w:rPr>
+          <w:b/>
+          <w:bCs/>
+        </w:rPr>
+        <w:t xml:space="preserve">Finalizar</w:t>
+      </w:r>
+      <w:r>
+        <w:t xml:space="preserve">; el sistema lo acepta aunque sea tarde. Si ya no puede hacerlo, informe al administrador que el vehículo sí se atendió, para que cierre la reserva como atendida y no como No asistió.</w:t>
+      </w:r>
+    </w:p>
+    <w:bookmarkEnd w:id="176"/>
+    <w:bookmarkEnd w:id="177"/>
+    <w:bookmarkStart w:id="178" w:name="X0da19bed606ac5b85df44bb666d43cc5fe8dad2"/>
     <w:p>
       <w:pPr>
         <w:pStyle w:val="Heading2"/>
@@ -16530,8 +16835,8 @@
         <w:t xml:space="preserve">Basado en el glosario de la documentación del proyecto.</w:t>
       </w:r>
     </w:p>
-    <w:bookmarkEnd w:id="176"/>
-    <w:bookmarkStart w:id="180" w:name="referencias"/>
+    <w:bookmarkEnd w:id="178"/>
+    <w:bookmarkStart w:id="182" w:name="referencias"/>
     <w:p>
       <w:pPr>
         <w:pStyle w:val="Heading2"/>
@@ -16563,7 +16868,7 @@
       <w:r>
         <w:t xml:space="preserve"> </w:t>
       </w:r>
-      <w:hyperlink r:id="rId177">
+      <w:hyperlink r:id="rId179">
         <w:r>
           <w:rPr>
             <w:rStyle w:val="Hyperlink"/>
@@ -16598,7 +16903,7 @@
       <w:r>
         <w:t xml:space="preserve"> </w:t>
       </w:r>
-      <w:hyperlink r:id="rId178">
+      <w:hyperlink r:id="rId180">
         <w:r>
           <w:rPr>
             <w:rStyle w:val="Hyperlink"/>
@@ -16633,7 +16938,7 @@
       <w:r>
         <w:t xml:space="preserve"> </w:t>
       </w:r>
-      <w:hyperlink r:id="rId179">
+      <w:hyperlink r:id="rId181">
         <w:r>
           <w:rPr>
             <w:rStyle w:val="Hyperlink"/>
@@ -16666,8 +16971,8 @@
         <w:t xml:space="preserve">[Material de formación no publicado]. Programa Tecnólogo en Análisis y Desarrollo de Software.</w:t>
       </w:r>
     </w:p>
-    <w:bookmarkEnd w:id="180"/>
-    <w:bookmarkStart w:id="183" w:name="X255ced412c2df704acebb526f0726616a787b49"/>
+    <w:bookmarkEnd w:id="182"/>
+    <w:bookmarkStart w:id="185" w:name="X255ced412c2df704acebb526f0726616a787b49"/>
     <w:p>
       <w:pPr>
         <w:pStyle w:val="Heading2"/>
@@ -16676,7 +16981,7 @@
         <w:t xml:space="preserve">15. Anexos</w:t>
       </w:r>
     </w:p>
-    <w:bookmarkStart w:id="181" w:name="anexo-a-origen-de-las-capturas"/>
+    <w:bookmarkStart w:id="183" w:name="anexo-a-origen-de-las-capturas"/>
     <w:p>
       <w:pPr>
         <w:pStyle w:val="Heading3"/>
@@ -16732,8 +17037,8 @@
         <w:t xml:space="preserve">.</w:t>
       </w:r>
     </w:p>
-    <w:bookmarkEnd w:id="181"/>
-    <w:bookmarkStart w:id="182" w:name="X34afeeb88a72e7f3d88bff03b64d75d94b908ab"/>
+    <w:bookmarkEnd w:id="183"/>
+    <w:bookmarkStart w:id="184" w:name="X34afeeb88a72e7f3d88bff03b64d75d94b908ab"/>
     <w:p>
       <w:pPr>
         <w:pStyle w:val="Heading3"/>
@@ -17038,9 +17343,9 @@
         <w:t xml:space="preserve">Adaptado de la lista de verificación de la guía para elaborar manuales de software (SENA, 2026).</w:t>
       </w:r>
     </w:p>
-    <w:bookmarkEnd w:id="182"/>
-    <w:bookmarkEnd w:id="183"/>
     <w:bookmarkEnd w:id="184"/>
+    <w:bookmarkEnd w:id="185"/>
+    <w:bookmarkEnd w:id="186"/>
     <w:sectPr>
       <w:footnotePr>
         <w:numRestart w:val="eachSect"/>

</xml_diff>